<commit_message>
Finalizar funcionalidade Documentação - Outros Cargos
- Corrigir extensão do template para .docx
- Carregar dados de cargos do cargos.json em vez de dict estático
- Adicionar suporte a scroll nos dropdowns (CTkOptionMenu)
- Corrigir inserção de quebras de linha nos campos multilinhas do .docx

Co-Authored-By: Claude Sonnet 4.6 <noreply@anthropic.com>
</commit_message>
<xml_diff>
--- a/arquivos/Relatorio Outro Cargos.docx
+++ b/arquivos/Relatorio Outro Cargos.docx
@@ -673,7 +673,6 @@
         <w:rPr>
           <w:rFonts w:ascii="Candara" w:hAnsi="Candara" w:cs="Arial"/>
           <w:b/>
-          <w:lang w:val="en-US"/>
         </w:rPr>
       </w:pPr>
       <w:r>
@@ -732,19 +731,11 @@
     </w:p>
     <w:p>
       <w:pPr>
-        <w:jc w:val="both"/>
-        <w:rPr>
-          <w:rFonts w:ascii="Candara" w:hAnsi="Candara" w:cs="Arial"/>
-          <w:b/>
-        </w:rPr>
-      </w:pPr>
-      <w:r>
-        <w:rPr>
-          <w:rFonts w:ascii="Candara" w:hAnsi="Candara" w:cs="Arial"/>
-          <w:b/>
-        </w:rPr>
-        <w:t xml:space="preserve">   </w:t>
-      </w:r>
+        <w:rPr>
+          <w:rFonts w:ascii="Candara" w:hAnsi="Candara" w:cs="Arial"/>
+          <w:b/>
+        </w:rPr>
+      </w:pPr>
       <w:r>
         <w:rPr>
           <w:rFonts w:ascii="Candara" w:hAnsi="Candara" w:cs="Arial"/>
@@ -2275,6 +2266,7 @@
       </w:rPr>
       <w:t>S</w:t>
     </w:r>
+    <w:proofErr w:type="spellStart"/>
     <w:r>
       <w:rPr>
         <w:rFonts w:ascii="Monotype Corsiva" w:hAnsi="Monotype Corsiva"/>
@@ -2282,7 +2274,17 @@
         <w:sz w:val="36"/>
         <w:szCs w:val="28"/>
       </w:rPr>
-      <w:t xml:space="preserve">ão </w:t>
+      <w:t>ão</w:t>
+    </w:r>
+    <w:proofErr w:type="spellEnd"/>
+    <w:r>
+      <w:rPr>
+        <w:rFonts w:ascii="Monotype Corsiva" w:hAnsi="Monotype Corsiva"/>
+        <w:bCs/>
+        <w:sz w:val="36"/>
+        <w:szCs w:val="28"/>
+      </w:rPr>
+      <w:t xml:space="preserve"> </w:t>
     </w:r>
     <w:r>
       <w:rPr>
@@ -2294,6 +2296,7 @@
       </w:rPr>
       <w:t>F</w:t>
     </w:r>
+    <w:proofErr w:type="spellStart"/>
     <w:r>
       <w:rPr>
         <w:rFonts w:ascii="Monotype Corsiva" w:hAnsi="Monotype Corsiva"/>
@@ -2301,7 +2304,17 @@
         <w:sz w:val="36"/>
         <w:szCs w:val="28"/>
       </w:rPr>
-      <w:t xml:space="preserve">rancisco de </w:t>
+      <w:t>rancisco</w:t>
+    </w:r>
+    <w:proofErr w:type="spellEnd"/>
+    <w:r>
+      <w:rPr>
+        <w:rFonts w:ascii="Monotype Corsiva" w:hAnsi="Monotype Corsiva"/>
+        <w:bCs/>
+        <w:sz w:val="36"/>
+        <w:szCs w:val="28"/>
+      </w:rPr>
+      <w:t xml:space="preserve"> de </w:t>
     </w:r>
     <w:r>
       <w:rPr>
@@ -3709,7 +3722,6 @@
     <w:uiPriority w:val="99"/>
     <w:semiHidden/>
     <w:unhideWhenUsed/>
-    <w:qFormat/>
     <w:tblPr>
       <w:tblInd w:w="0" w:type="dxa"/>
       <w:tblCellMar>
@@ -4268,7 +4280,17 @@
 </file>
 
 <file path=customXml/item1.xml><?xml version="1.0" encoding="utf-8"?>
-<b:Sources xmlns:b="http://schemas.openxmlformats.org/officeDocument/2006/bibliography" xmlns="http://schemas.openxmlformats.org/officeDocument/2006/bibliography" SelectedStyle="\apasixtheditionofficeonline.xsl" StyleName="APA" Version="6"/>
+<p:properties xmlns:p="http://schemas.microsoft.com/office/2006/metadata/properties" xmlns:xsi="http://www.w3.org/2001/XMLSchema-instance" xmlns:pc="http://schemas.microsoft.com/office/infopath/2007/PartnerControls">
+  <documentManagement>
+    <_SourceUrl xmlns="http://schemas.microsoft.com/sharepoint/v3" xsi:nil="true"/>
+    <AutoVersionDisabled xmlns="http://schemas.microsoft.com/sharepoint/v3">false</AutoVersionDisabled>
+    <ItemType xmlns="http://schemas.microsoft.com/sharepoint/v3">1</ItemType>
+    <Order xmlns="http://schemas.microsoft.com/sharepoint/v3" xsi:nil="true"/>
+    <_SharedFileIndex xmlns="http://schemas.microsoft.com/sharepoint/v3" xsi:nil="true"/>
+    <MetaInfo xmlns="http://schemas.microsoft.com/sharepoint/v3" xsi:nil="true"/>
+    <Description xmlns="http://schemas.microsoft.com/sharepoint/v3" xsi:nil="true"/>
+  </documentManagement>
+</p:properties>
 </file>
 
 <file path=customXml/item2.xml><?xml version="1.0" encoding="utf-8"?>
@@ -4626,23 +4648,15 @@
 </file>
 
 <file path=customXml/item3.xml><?xml version="1.0" encoding="utf-8"?>
-<p:properties xmlns:p="http://schemas.microsoft.com/office/2006/metadata/properties" xmlns:xsi="http://www.w3.org/2001/XMLSchema-instance" xmlns:pc="http://schemas.microsoft.com/office/infopath/2007/PartnerControls">
-  <documentManagement>
-    <_SourceUrl xmlns="http://schemas.microsoft.com/sharepoint/v3" xsi:nil="true"/>
-    <AutoVersionDisabled xmlns="http://schemas.microsoft.com/sharepoint/v3">false</AutoVersionDisabled>
-    <ItemType xmlns="http://schemas.microsoft.com/sharepoint/v3">1</ItemType>
-    <Order xmlns="http://schemas.microsoft.com/sharepoint/v3" xsi:nil="true"/>
-    <_SharedFileIndex xmlns="http://schemas.microsoft.com/sharepoint/v3" xsi:nil="true"/>
-    <MetaInfo xmlns="http://schemas.microsoft.com/sharepoint/v3" xsi:nil="true"/>
-    <Description xmlns="http://schemas.microsoft.com/sharepoint/v3" xsi:nil="true"/>
-  </documentManagement>
-</p:properties>
+<b:Sources xmlns:b="http://schemas.openxmlformats.org/officeDocument/2006/bibliography" xmlns="http://schemas.openxmlformats.org/officeDocument/2006/bibliography" SelectedStyle="\apasixtheditionofficeonline.xsl" StyleName="APA" Version="6"/>
 </file>
 
 <file path=customXml/itemProps1.xml><?xml version="1.0" encoding="utf-8"?>
-<ds:datastoreItem xmlns:ds="http://schemas.openxmlformats.org/officeDocument/2006/customXml" ds:itemID="{788EB358-59A1-4CC5-BF9F-7C29C3D076D2}">
+<ds:datastoreItem xmlns:ds="http://schemas.openxmlformats.org/officeDocument/2006/customXml" ds:itemID="{A1C898E6-08DF-4B71-B8F3-460739C3CFD1}">
   <ds:schemaRefs>
-    <ds:schemaRef ds:uri="http://schemas.openxmlformats.org/officeDocument/2006/bibliography"/>
+    <ds:schemaRef ds:uri="http://schemas.microsoft.com/office/2006/metadata/properties"/>
+    <ds:schemaRef ds:uri="http://schemas.microsoft.com/office/infopath/2007/PartnerControls"/>
+    <ds:schemaRef ds:uri="http://schemas.microsoft.com/sharepoint/v3"/>
   </ds:schemaRefs>
 </ds:datastoreItem>
 </file>
@@ -4665,11 +4679,9 @@
 </file>
 
 <file path=customXml/itemProps3.xml><?xml version="1.0" encoding="utf-8"?>
-<ds:datastoreItem xmlns:ds="http://schemas.openxmlformats.org/officeDocument/2006/customXml" ds:itemID="{A1C898E6-08DF-4B71-B8F3-460739C3CFD1}">
+<ds:datastoreItem xmlns:ds="http://schemas.openxmlformats.org/officeDocument/2006/customXml" ds:itemID="{788EB358-59A1-4CC5-BF9F-7C29C3D076D2}">
   <ds:schemaRefs>
-    <ds:schemaRef ds:uri="http://schemas.microsoft.com/office/2006/metadata/properties"/>
-    <ds:schemaRef ds:uri="http://schemas.microsoft.com/office/infopath/2007/PartnerControls"/>
-    <ds:schemaRef ds:uri="http://schemas.microsoft.com/sharepoint/v3"/>
+    <ds:schemaRef ds:uri="http://schemas.openxmlformats.org/officeDocument/2006/bibliography"/>
   </ds:schemaRefs>
 </ds:datastoreItem>
 </file>
</xml_diff>

<commit_message>
Atualizar arquivos de suporte para release beta_v0.0.3
Co-Authored-By: Claude Sonnet 4.6 <noreply@anthropic.com>
</commit_message>
<xml_diff>
--- a/arquivos/Relatorio Outro Cargos.docx
+++ b/arquivos/Relatorio Outro Cargos.docx
@@ -669,7 +669,6 @@
     </w:p>
     <w:p>
       <w:pPr>
-        <w:jc w:val="both"/>
         <w:rPr>
           <w:rFonts w:ascii="Candara" w:hAnsi="Candara" w:cs="Arial"/>
           <w:b/>
@@ -685,7 +684,6 @@
     </w:p>
     <w:p>
       <w:pPr>
-        <w:jc w:val="both"/>
         <w:rPr>
           <w:rFonts w:ascii="Candara" w:hAnsi="Candara" w:cs="Arial"/>
           <w:b/>
@@ -715,7 +713,6 @@
     </w:p>
     <w:p>
       <w:pPr>
-        <w:jc w:val="both"/>
         <w:rPr>
           <w:rFonts w:ascii="Candara" w:hAnsi="Candara" w:cs="Arial"/>
           <w:b/>
@@ -4280,17 +4277,7 @@
 </file>
 
 <file path=customXml/item1.xml><?xml version="1.0" encoding="utf-8"?>
-<p:properties xmlns:p="http://schemas.microsoft.com/office/2006/metadata/properties" xmlns:xsi="http://www.w3.org/2001/XMLSchema-instance" xmlns:pc="http://schemas.microsoft.com/office/infopath/2007/PartnerControls">
-  <documentManagement>
-    <_SourceUrl xmlns="http://schemas.microsoft.com/sharepoint/v3" xsi:nil="true"/>
-    <AutoVersionDisabled xmlns="http://schemas.microsoft.com/sharepoint/v3">false</AutoVersionDisabled>
-    <ItemType xmlns="http://schemas.microsoft.com/sharepoint/v3">1</ItemType>
-    <Order xmlns="http://schemas.microsoft.com/sharepoint/v3" xsi:nil="true"/>
-    <_SharedFileIndex xmlns="http://schemas.microsoft.com/sharepoint/v3" xsi:nil="true"/>
-    <MetaInfo xmlns="http://schemas.microsoft.com/sharepoint/v3" xsi:nil="true"/>
-    <Description xmlns="http://schemas.microsoft.com/sharepoint/v3" xsi:nil="true"/>
-  </documentManagement>
-</p:properties>
+<b:Sources xmlns:b="http://schemas.openxmlformats.org/officeDocument/2006/bibliography" xmlns="http://schemas.openxmlformats.org/officeDocument/2006/bibliography" SelectedStyle="\apasixtheditionofficeonline.xsl" StyleName="APA" Version="6"/>
 </file>
 
 <file path=customXml/item2.xml><?xml version="1.0" encoding="utf-8"?>
@@ -4648,15 +4635,23 @@
 </file>
 
 <file path=customXml/item3.xml><?xml version="1.0" encoding="utf-8"?>
-<b:Sources xmlns:b="http://schemas.openxmlformats.org/officeDocument/2006/bibliography" xmlns="http://schemas.openxmlformats.org/officeDocument/2006/bibliography" SelectedStyle="\apasixtheditionofficeonline.xsl" StyleName="APA" Version="6"/>
+<p:properties xmlns:p="http://schemas.microsoft.com/office/2006/metadata/properties" xmlns:xsi="http://www.w3.org/2001/XMLSchema-instance" xmlns:pc="http://schemas.microsoft.com/office/infopath/2007/PartnerControls">
+  <documentManagement>
+    <_SourceUrl xmlns="http://schemas.microsoft.com/sharepoint/v3" xsi:nil="true"/>
+    <AutoVersionDisabled xmlns="http://schemas.microsoft.com/sharepoint/v3">false</AutoVersionDisabled>
+    <ItemType xmlns="http://schemas.microsoft.com/sharepoint/v3">1</ItemType>
+    <Order xmlns="http://schemas.microsoft.com/sharepoint/v3" xsi:nil="true"/>
+    <_SharedFileIndex xmlns="http://schemas.microsoft.com/sharepoint/v3" xsi:nil="true"/>
+    <MetaInfo xmlns="http://schemas.microsoft.com/sharepoint/v3" xsi:nil="true"/>
+    <Description xmlns="http://schemas.microsoft.com/sharepoint/v3" xsi:nil="true"/>
+  </documentManagement>
+</p:properties>
 </file>
 
 <file path=customXml/itemProps1.xml><?xml version="1.0" encoding="utf-8"?>
-<ds:datastoreItem xmlns:ds="http://schemas.openxmlformats.org/officeDocument/2006/customXml" ds:itemID="{A1C898E6-08DF-4B71-B8F3-460739C3CFD1}">
+<ds:datastoreItem xmlns:ds="http://schemas.openxmlformats.org/officeDocument/2006/customXml" ds:itemID="{788EB358-59A1-4CC5-BF9F-7C29C3D076D2}">
   <ds:schemaRefs>
-    <ds:schemaRef ds:uri="http://schemas.microsoft.com/office/2006/metadata/properties"/>
-    <ds:schemaRef ds:uri="http://schemas.microsoft.com/office/infopath/2007/PartnerControls"/>
-    <ds:schemaRef ds:uri="http://schemas.microsoft.com/sharepoint/v3"/>
+    <ds:schemaRef ds:uri="http://schemas.openxmlformats.org/officeDocument/2006/bibliography"/>
   </ds:schemaRefs>
 </ds:datastoreItem>
 </file>
@@ -4679,9 +4674,11 @@
 </file>
 
 <file path=customXml/itemProps3.xml><?xml version="1.0" encoding="utf-8"?>
-<ds:datastoreItem xmlns:ds="http://schemas.openxmlformats.org/officeDocument/2006/customXml" ds:itemID="{788EB358-59A1-4CC5-BF9F-7C29C3D076D2}">
+<ds:datastoreItem xmlns:ds="http://schemas.openxmlformats.org/officeDocument/2006/customXml" ds:itemID="{A1C898E6-08DF-4B71-B8F3-460739C3CFD1}">
   <ds:schemaRefs>
-    <ds:schemaRef ds:uri="http://schemas.openxmlformats.org/officeDocument/2006/bibliography"/>
+    <ds:schemaRef ds:uri="http://schemas.microsoft.com/office/2006/metadata/properties"/>
+    <ds:schemaRef ds:uri="http://schemas.microsoft.com/office/infopath/2007/PartnerControls"/>
+    <ds:schemaRef ds:uri="http://schemas.microsoft.com/sharepoint/v3"/>
   </ds:schemaRefs>
 </ds:datastoreItem>
 </file>
</xml_diff>

<commit_message>
Melhorar documentacao e cadastro de assinaturas
</commit_message>
<xml_diff>
--- a/arquivos/Relatorio Outro Cargos.docx
+++ b/arquivos/Relatorio Outro Cargos.docx
@@ -1857,10 +1857,7 @@
         </w:rPr>
       </w:pPr>
       <w:r>
-        <w:rPr>
-          <w:rFonts w:ascii="Candara" w:hAnsi="Candara" w:cs="Arial"/>
-        </w:rPr>
-        <w:t>Rodrigo Liberato dos Santos</w:t>
+        <w:t>{{NOME_ASSINATURA}}</w:t>
       </w:r>
     </w:p>
     <w:p>
@@ -1873,12 +1870,7 @@
         </w:rPr>
       </w:pPr>
       <w:r>
-        <w:rPr>
-          <w:rFonts w:ascii="Arial" w:hAnsi="Arial" w:cs="Arial"/>
-          <w:sz w:val="18"/>
-          <w:szCs w:val="18"/>
-        </w:rPr>
-        <w:t>Oficial Administrativo</w:t>
+        <w:t>{{CARGO ASSINATURA}}</w:t>
       </w:r>
     </w:p>
     <w:p>
@@ -1891,34 +1883,8 @@
           <w:rFonts w:ascii="Candara" w:hAnsi="Candara" w:cs="Arial"/>
         </w:rPr>
       </w:pPr>
-      <w:proofErr w:type="gramStart"/>
-      <w:r>
-        <w:rPr>
-          <w:rFonts w:ascii="Arial" w:hAnsi="Arial" w:cs="Arial"/>
-          <w:b/>
-          <w:sz w:val="18"/>
-          <w:szCs w:val="18"/>
-        </w:rPr>
-        <w:t>Matricula</w:t>
-      </w:r>
-      <w:proofErr w:type="gramEnd"/>
-      <w:r>
-        <w:rPr>
-          <w:rFonts w:ascii="Arial" w:hAnsi="Arial" w:cs="Arial"/>
-          <w:b/>
-          <w:sz w:val="18"/>
-          <w:szCs w:val="18"/>
-        </w:rPr>
-        <w:t xml:space="preserve">: </w:t>
-      </w:r>
-      <w:r>
-        <w:rPr>
-          <w:rFonts w:ascii="Arial" w:hAnsi="Arial" w:cs="Arial"/>
-          <w:b/>
-          <w:sz w:val="18"/>
-          <w:szCs w:val="18"/>
-        </w:rPr>
-        <w:t>5761</w:t>
+      <w:r>
+        <w:t>{{PORTARIA ASSINATURA}}</w:t>
       </w:r>
     </w:p>
     <w:sectPr>

</xml_diff>